<commit_message>
Tree based clustering init
</commit_message>
<xml_diff>
--- a/Lab Report.docx
+++ b/Lab Report.docx
@@ -5905,7 +5905,16 @@
                 <w:sz w:val="24"/>
                 <w:szCs w:val="24"/>
               </w:rPr>
-              <w:t>Code</w:t>
+              <w:t>Cod</w:t>
+            </w:r>
+            <w:r>
+              <w:rPr>
+                <w:rStyle w:val="Hyperlink"/>
+                <w:noProof/>
+                <w:sz w:val="24"/>
+                <w:szCs w:val="24"/>
+              </w:rPr>
+              <w:t>e</w:t>
             </w:r>
             <w:r>
               <w:rPr>
@@ -8283,25 +8292,7 @@
                 <w:sz w:val="24"/>
                 <w:szCs w:val="24"/>
               </w:rPr>
-              <w:t xml:space="preserve">Implementation on </w:t>
-            </w:r>
-            <w:r>
-              <w:rPr>
-                <w:rStyle w:val="Hyperlink"/>
-                <w:noProof/>
-                <w:sz w:val="24"/>
-                <w:szCs w:val="24"/>
-              </w:rPr>
-              <w:t>S</w:t>
-            </w:r>
-            <w:r>
-              <w:rPr>
-                <w:rStyle w:val="Hyperlink"/>
-                <w:noProof/>
-                <w:sz w:val="24"/>
-                <w:szCs w:val="24"/>
-              </w:rPr>
-              <w:t>ynthetic Data</w:t>
+              <w:t>Implementation on Synthetic Data</w:t>
             </w:r>
             <w:r>
               <w:rPr>
@@ -9050,18 +9041,8 @@
             <w:rFonts w:cs="Times New Roman"/>
             <w:color w:val="EE0000"/>
           </w:rPr>
-          <w:t>K-</w:t>
+          <w:t>K-Means_Code</w:t>
         </w:r>
-        <w:proofErr w:type="spellStart"/>
-        <w:r>
-          <w:rPr>
-            <w:rStyle w:val="Hyperlink"/>
-            <w:rFonts w:cs="Times New Roman"/>
-            <w:color w:val="EE0000"/>
-          </w:rPr>
-          <w:t>Means_Code</w:t>
-        </w:r>
-        <w:proofErr w:type="spellEnd"/>
       </w:hyperlink>
     </w:p>
     <w:p>
@@ -9076,23 +9057,7 @@
     </w:p>
     <w:p>
       <w:r>
-        <w:t xml:space="preserve">To visualize how K-Means behaves, a simple 2D dataset with three clusters was created using </w:t>
-      </w:r>
-      <w:proofErr w:type="spellStart"/>
-      <w:r>
-        <w:t>make_</w:t>
-      </w:r>
-      <w:proofErr w:type="gramStart"/>
-      <w:r>
-        <w:t>blobs</w:t>
-      </w:r>
-      <w:proofErr w:type="spellEnd"/>
-      <w:r>
-        <w:t>(</w:t>
-      </w:r>
-      <w:proofErr w:type="gramEnd"/>
-      <w:r>
-        <w:t>).</w:t>
+        <w:t>To visualize how K-Means behaves, a simple 2D dataset with three clusters was created using make_blobs().</w:t>
       </w:r>
     </w:p>
     <w:p>
@@ -9308,20 +9273,7 @@
     </w:p>
     <w:p>
       <w:r>
-        <w:t xml:space="preserve">Before clustering, the data was standardized using </w:t>
-      </w:r>
-      <w:proofErr w:type="spellStart"/>
-      <w:proofErr w:type="gramStart"/>
-      <w:r>
-        <w:t>StandardScaler</w:t>
-      </w:r>
-      <w:proofErr w:type="spellEnd"/>
-      <w:r>
-        <w:t>(</w:t>
-      </w:r>
-      <w:proofErr w:type="gramEnd"/>
-      <w:r>
-        <w:t>) to ensure that all features contributed equally to the distance calculations. This transformation scales each feature to have a mean of 0 and a standard deviation of 1, making the variables comparable across dimensions.</w:t>
+        <w:t>Before clustering, the data was standardized using StandardScaler() to ensure that all features contributed equally to the distance calculations. This transformation scales each feature to have a mean of 0 and a standard deviation of 1, making the variables comparable across dimensions.</w:t>
       </w:r>
     </w:p>
     <w:p>
@@ -9999,15 +9951,7 @@
       <w:bookmarkStart w:id="12" w:name="_Toc217906456"/>
       <w:r>
         <w:lastRenderedPageBreak/>
-        <w:t xml:space="preserve">Lab 2 </w:t>
-      </w:r>
-      <w:proofErr w:type="gramStart"/>
-      <w:r>
-        <w:t>-  DBSCAN</w:t>
-      </w:r>
-      <w:proofErr w:type="gramEnd"/>
-      <w:r>
-        <w:t xml:space="preserve"> Clustering</w:t>
+        <w:t>Lab 2 -  DBSCAN Clustering</w:t>
       </w:r>
       <w:bookmarkEnd w:id="12"/>
     </w:p>
@@ -10047,7 +9991,6 @@
       <w:r>
         <w:t xml:space="preserve">, </w:t>
       </w:r>
-      <w:proofErr w:type="spellStart"/>
       <w:r>
         <w:rPr>
           <w:b/>
@@ -10055,7 +9998,6 @@
         </w:rPr>
         <w:t>min_samples</w:t>
       </w:r>
-      <w:proofErr w:type="spellEnd"/>
       <w:r>
         <w:t xml:space="preserve">) and the roles of core, border, and noise points. </w:t>
       </w:r>
@@ -10130,15 +10072,7 @@
     </w:p>
     <w:p>
       <w:r>
-        <w:t xml:space="preserve">DBSCAN (Density-Based Spatial Clustering of Applications with Noise) is a density-based clustering algorithm that groups together </w:t>
-      </w:r>
-      <w:proofErr w:type="gramStart"/>
-      <w:r>
-        <w:t>points</w:t>
-      </w:r>
-      <w:proofErr w:type="gramEnd"/>
-      <w:r>
-        <w:t xml:space="preserve"> closely packed in space, while marking isolated points as noise. It defines clusters based on two parameters:</w:t>
+        <w:t>DBSCAN (Density-Based Spatial Clustering of Applications with Noise) is a density-based clustering algorithm that groups together points closely packed in space, while marking isolated points as noise. It defines clusters based on two parameters:</w:t>
       </w:r>
     </w:p>
     <w:p>
@@ -10161,26 +10095,13 @@
           <w:numId w:val="26"/>
         </w:numPr>
       </w:pPr>
-      <w:proofErr w:type="spellStart"/>
-      <w:r>
-        <w:t>min_samples</w:t>
-      </w:r>
-      <w:proofErr w:type="spellEnd"/>
-      <w:r>
-        <w:t>: the minimum number of points required to form a dense region.</w:t>
-      </w:r>
-    </w:p>
-    <w:p>
-      <w:r>
-        <w:t xml:space="preserve">Conceptually, the method considers a neighborhood of radius ε around each point in the dataset. If this neighborhood contains at least </w:t>
-      </w:r>
-      <w:proofErr w:type="spellStart"/>
-      <w:r>
-        <w:t>min_samples</w:t>
-      </w:r>
-      <w:proofErr w:type="spellEnd"/>
-      <w:r>
-        <w:t xml:space="preserve"> points, the point is classified as a </w:t>
+      <w:r>
+        <w:t>min_samples: the minimum number of points required to form a dense region.</w:t>
+      </w:r>
+    </w:p>
+    <w:p>
+      <w:r>
+        <w:t xml:space="preserve">Conceptually, the method considers a neighborhood of radius ε around each point in the dataset. If this neighborhood contains at least min_samples points, the point is classified as a </w:t>
       </w:r>
       <w:r>
         <w:rPr>
@@ -10231,15 +10152,7 @@
         <w:t xml:space="preserve"> </w:t>
       </w:r>
       <w:r>
-        <w:t xml:space="preserve">Unlike K-Means, DBSCAN does not require specifying the number of clusters and can identify clusters of arbitrary shapes, making it robust for non-spherical data and outlier detection. However, its performance depends strongly on suitable ε and </w:t>
-      </w:r>
-      <w:proofErr w:type="spellStart"/>
-      <w:r>
-        <w:t>min_samples</w:t>
-      </w:r>
-      <w:proofErr w:type="spellEnd"/>
-      <w:r>
-        <w:t xml:space="preserve"> values</w:t>
+        <w:t>Unlike K-Means, DBSCAN does not require specifying the number of clusters and can identify clusters of arbitrary shapes, making it robust for non-spherical data and outlier detection. However, its performance depends strongly on suitable ε and min_samples values</w:t>
       </w:r>
       <w:r>
         <w:t>.</w:t>
@@ -10274,7 +10187,6 @@
         <w:t xml:space="preserve"> </w:t>
       </w:r>
       <w:hyperlink r:id="rId19" w:history="1">
-        <w:proofErr w:type="spellStart"/>
         <w:r>
           <w:rPr>
             <w:rStyle w:val="Hyperlink"/>
@@ -10282,7 +10194,6 @@
           </w:rPr>
           <w:t>DBSCAN_Code</w:t>
         </w:r>
-        <w:proofErr w:type="spellEnd"/>
       </w:hyperlink>
       <w:r>
         <w:t xml:space="preserve"> </w:t>
@@ -10306,31 +10217,7 @@
     </w:p>
     <w:p>
       <w:r>
-        <w:t xml:space="preserve">A two-dimensional non-spherical dataset was generated using the </w:t>
-      </w:r>
-      <w:proofErr w:type="spellStart"/>
-      <w:r>
-        <w:t>make_</w:t>
-      </w:r>
-      <w:proofErr w:type="gramStart"/>
-      <w:r>
-        <w:t>moons</w:t>
-      </w:r>
-      <w:proofErr w:type="spellEnd"/>
-      <w:r>
-        <w:t>(</w:t>
-      </w:r>
-      <w:proofErr w:type="gramEnd"/>
-      <w:r>
-        <w:t xml:space="preserve">) function with 300 samples and a noise level of 0.05. This dataset was selected because it cannot be effectively separated by algorithms that assume spherical clusters, such as K-Means. The DBSCAN algorithm was applied with parameters ε = 0.2 and </w:t>
-      </w:r>
-      <w:proofErr w:type="spellStart"/>
-      <w:r>
-        <w:t>min_samples</w:t>
-      </w:r>
-      <w:proofErr w:type="spellEnd"/>
-      <w:r>
-        <w:t xml:space="preserve"> = 5 to identify the two crescent-shaped clusters.</w:t>
+        <w:t>A two-dimensional non-spherical dataset was generated using the make_moons() function with 300 samples and a noise level of 0.05. This dataset was selected because it cannot be effectively separated by algorithms that assume spherical clusters, such as K-Means. The DBSCAN algorithm was applied with parameters ε = 0.2 and min_samples = 5 to identify the two crescent-shaped clusters.</w:t>
       </w:r>
     </w:p>
     <w:p>
@@ -10340,23 +10227,7 @@
     </w:p>
     <w:p>
       <w:r>
-        <w:t xml:space="preserve">A smaller ε value tends to fragment the data into numerous small clusters, often increasing the number of noise points and resulting in underfitting, where the model is too rigid to capture the full cluster structure. Conversely, an excessively large ε may merge distinct regions into a single cluster, leading to overfitting, where the model becomes too general and fails to preserve meaningful boundaries. Similarly, a low </w:t>
-      </w:r>
-      <w:proofErr w:type="spellStart"/>
-      <w:r>
-        <w:t>min_samples</w:t>
-      </w:r>
-      <w:proofErr w:type="spellEnd"/>
-      <w:r>
-        <w:t xml:space="preserve"> value allows small or spurious clusters to form, while a high </w:t>
-      </w:r>
-      <w:proofErr w:type="spellStart"/>
-      <w:r>
-        <w:t>min_samples</w:t>
-      </w:r>
-      <w:proofErr w:type="spellEnd"/>
-      <w:r>
-        <w:t xml:space="preserve"> value enforces stricter density requirements that may exclude legitimate but less dense clusters. </w:t>
+        <w:t xml:space="preserve">A smaller ε value tends to fragment the data into numerous small clusters, often increasing the number of noise points and resulting in underfitting, where the model is too rigid to capture the full cluster structure. Conversely, an excessively large ε may merge distinct regions into a single cluster, leading to overfitting, where the model becomes too general and fails to preserve meaningful boundaries. Similarly, a low min_samples value allows small or spurious clusters to form, while a high min_samples value enforces stricter density requirements that may exclude legitimate but less dense clusters. </w:t>
       </w:r>
     </w:p>
     <w:p>
@@ -10440,47 +10311,7 @@
           <w:sz w:val="22"/>
           <w:szCs w:val="22"/>
         </w:rPr>
-        <w:t xml:space="preserve">Generated two-dimensional non-spherical dataset (two-moons) created using the </w:t>
-      </w:r>
-      <w:proofErr w:type="spellStart"/>
-      <w:r>
-        <w:rPr>
-          <w:i/>
-          <w:iCs/>
-          <w:sz w:val="22"/>
-          <w:szCs w:val="22"/>
-        </w:rPr>
-        <w:t>make_</w:t>
-      </w:r>
-      <w:proofErr w:type="gramStart"/>
-      <w:r>
-        <w:rPr>
-          <w:i/>
-          <w:iCs/>
-          <w:sz w:val="22"/>
-          <w:szCs w:val="22"/>
-        </w:rPr>
-        <w:t>moons</w:t>
-      </w:r>
-      <w:proofErr w:type="spellEnd"/>
-      <w:r>
-        <w:rPr>
-          <w:i/>
-          <w:iCs/>
-          <w:sz w:val="22"/>
-          <w:szCs w:val="22"/>
-        </w:rPr>
-        <w:t>(</w:t>
-      </w:r>
-      <w:proofErr w:type="gramEnd"/>
-      <w:r>
-        <w:rPr>
-          <w:i/>
-          <w:iCs/>
-          <w:sz w:val="22"/>
-          <w:szCs w:val="22"/>
-        </w:rPr>
-        <w:t>) function.</w:t>
+        <w:t>Generated two-dimensional non-spherical dataset (two-moons) created using the make_moons() function.</w:t>
       </w:r>
     </w:p>
     <w:p>
@@ -10567,23 +10398,7 @@
           <w:i/>
           <w:iCs/>
         </w:rPr>
-        <w:t xml:space="preserve">DBSCAN clustering result on the two-moons dataset using parameters ε = 0.2 and </w:t>
-      </w:r>
-      <w:proofErr w:type="spellStart"/>
-      <w:r>
-        <w:rPr>
-          <w:i/>
-          <w:iCs/>
-        </w:rPr>
-        <w:t>min_samples</w:t>
-      </w:r>
-      <w:proofErr w:type="spellEnd"/>
-      <w:r>
-        <w:rPr>
-          <w:i/>
-          <w:iCs/>
-        </w:rPr>
-        <w:t xml:space="preserve"> = 5.</w:t>
+        <w:t>DBSCAN clustering result on the two-moons dataset using parameters ε = 0.2 and min_samples = 5.</w:t>
       </w:r>
     </w:p>
     <w:p>
@@ -10598,15 +10413,7 @@
     </w:p>
     <w:p>
       <w:r>
-        <w:t xml:space="preserve">To examine the influence of DBSCAN’s parameters, experiments were conducted by varying ε and </w:t>
-      </w:r>
-      <w:proofErr w:type="spellStart"/>
-      <w:r>
-        <w:t>min_samples</w:t>
-      </w:r>
-      <w:proofErr w:type="spellEnd"/>
-      <w:r>
-        <w:t xml:space="preserve"> independently.</w:t>
+        <w:t>To examine the influence of DBSCAN’s parameters, experiments were conducted by varying ε and min_samples independently.</w:t>
       </w:r>
     </w:p>
     <w:p>
@@ -10689,48 +10496,12 @@
           <w:sz w:val="22"/>
           <w:szCs w:val="22"/>
         </w:rPr>
-        <w:t xml:space="preserve">DBSCAN results with varying ε values (0.1, 0.2, 0.3, 0.5) and fixed </w:t>
-      </w:r>
-      <w:proofErr w:type="spellStart"/>
-      <w:r>
-        <w:rPr>
-          <w:i/>
-          <w:iCs/>
-          <w:sz w:val="22"/>
-          <w:szCs w:val="22"/>
-        </w:rPr>
-        <w:t>min_samples</w:t>
-      </w:r>
-      <w:proofErr w:type="spellEnd"/>
-      <w:r>
-        <w:rPr>
-          <w:i/>
-          <w:iCs/>
-          <w:sz w:val="22"/>
-          <w:szCs w:val="22"/>
-        </w:rPr>
-        <w:t xml:space="preserve"> = 5.</w:t>
-      </w:r>
-    </w:p>
-    <w:p>
-      <w:r>
-        <w:t xml:space="preserve">Similarly, increasing </w:t>
-      </w:r>
-      <w:proofErr w:type="spellStart"/>
-      <w:r>
-        <w:t>min_samples</w:t>
-      </w:r>
-      <w:proofErr w:type="spellEnd"/>
-      <w:r>
-        <w:t xml:space="preserve"> made the density criterion progressively stricter, reducing the number of core points and increasing noise, especially at higher values. Smaller </w:t>
-      </w:r>
-      <w:proofErr w:type="spellStart"/>
-      <w:r>
-        <w:t>min_samples</w:t>
-      </w:r>
-      <w:proofErr w:type="spellEnd"/>
-      <w:r>
-        <w:t xml:space="preserve"> values (e.g., 3–5) produced stable and coherent clusters, while very large values (e.g., 20) led to overly conservative clustering that excluded many valid points at the edges of each crescent</w:t>
+        <w:t>DBSCAN results with varying ε values (0.1, 0.2, 0.3, 0.5) and fixed min_samples = 5.</w:t>
+      </w:r>
+    </w:p>
+    <w:p>
+      <w:r>
+        <w:t>Similarly, increasing min_samples made the density criterion progressively stricter, reducing the number of core points and increasing noise, especially at higher values. Smaller min_samples values (e.g., 3–5) produced stable and coherent clusters, while very large values (e.g., 20) led to overly conservative clustering that excluded many valid points at the edges of each crescent</w:t>
       </w:r>
       <w:r>
         <w:t>.</w:t>
@@ -10825,40 +10596,12 @@
           <w:sz w:val="22"/>
           <w:szCs w:val="22"/>
         </w:rPr>
-        <w:t xml:space="preserve">BSCAN results with varying </w:t>
-      </w:r>
-      <w:proofErr w:type="spellStart"/>
-      <w:r>
-        <w:rPr>
-          <w:i/>
-          <w:iCs/>
-          <w:sz w:val="22"/>
-          <w:szCs w:val="22"/>
-        </w:rPr>
-        <w:t>min_samples</w:t>
-      </w:r>
-      <w:proofErr w:type="spellEnd"/>
-      <w:r>
-        <w:rPr>
-          <w:i/>
-          <w:iCs/>
-          <w:sz w:val="22"/>
-          <w:szCs w:val="22"/>
-        </w:rPr>
-        <w:t xml:space="preserve"> values (3, 5, 10, 20) and fixed ε = 0.2. </w:t>
-      </w:r>
-    </w:p>
-    <w:p>
-      <w:r>
-        <w:t xml:space="preserve">An intermediate configuration (ε = 0.2, </w:t>
-      </w:r>
-      <w:proofErr w:type="spellStart"/>
-      <w:r>
-        <w:t>min_samples</w:t>
-      </w:r>
-      <w:proofErr w:type="spellEnd"/>
-      <w:r>
-        <w:t xml:space="preserve"> = 5) yielded the most coherent and balanced clustering.</w:t>
+        <w:t xml:space="preserve">BSCAN results with varying min_samples values (3, 5, 10, 20) and fixed ε = 0.2. </w:t>
+      </w:r>
+    </w:p>
+    <w:p>
+      <w:r>
+        <w:t>An intermediate configuration (ε = 0.2, min_samples = 5) yielded the most coherent and balanced clustering.</w:t>
       </w:r>
     </w:p>
     <w:p>
@@ -10957,23 +10700,7 @@
           <w:i/>
           <w:iCs/>
         </w:rPr>
-        <w:t xml:space="preserve">Comparison of clustering performance on the non-spherical two-moons dataset between DBSCAN (ε = 0.2, </w:t>
-      </w:r>
-      <w:proofErr w:type="spellStart"/>
-      <w:r>
-        <w:rPr>
-          <w:i/>
-          <w:iCs/>
-        </w:rPr>
-        <w:t>min_samples</w:t>
-      </w:r>
-      <w:proofErr w:type="spellEnd"/>
-      <w:r>
-        <w:rPr>
-          <w:i/>
-          <w:iCs/>
-        </w:rPr>
-        <w:t xml:space="preserve"> = 5) on the left and K-Means (k = 2) on the right.</w:t>
+        <w:t>Comparison of clustering performance on the non-spherical two-moons dataset between DBSCAN (ε = 0.2, min_samples = 5) on the left and K-Means (k = 2) on the right.</w:t>
       </w:r>
     </w:p>
     <w:p>
@@ -10988,28 +10715,12 @@
     </w:p>
     <w:p>
       <w:r>
-        <w:t xml:space="preserve">The Iris dataset was used to evaluate DBSCAN on real-world, multi-dimensional data. The feature variables were standardized using </w:t>
-      </w:r>
-      <w:proofErr w:type="spellStart"/>
-      <w:r>
-        <w:t>StandardScaler</w:t>
-      </w:r>
-      <w:proofErr w:type="spellEnd"/>
-      <w:r>
-        <w:t xml:space="preserve"> to ensure equal contribution of all attributes to the distance metric. Dimensionality reduction was then performed using Principal Component Analysis (PCA) to project the four-dimensional data into two principal components for visualization purposes only.</w:t>
-      </w:r>
-    </w:p>
-    <w:p>
-      <w:r>
-        <w:t xml:space="preserve">DBSCAN was applied to the standardized data using parameters ε = 0.6 and </w:t>
-      </w:r>
-      <w:proofErr w:type="spellStart"/>
-      <w:r>
-        <w:t>min_samples</w:t>
-      </w:r>
-      <w:proofErr w:type="spellEnd"/>
-      <w:r>
-        <w:t xml:space="preserve"> = 5. The algorithm identified several compact regions of high density corresponding to potential clusters while labeling certain ambiguous samples as noise. The resulting two-dimensional PCA projection revealed visually separable groups that broadly corresponded to the Iris species, although some overlap occurred between Iris versicolor and Iris virginica, which are known to have similar feature distributions. </w:t>
+        <w:t>The Iris dataset was used to evaluate DBSCAN on real-world, multi-dimensional data. The feature variables were standardized using StandardScaler to ensure equal contribution of all attributes to the distance metric. Dimensionality reduction was then performed using Principal Component Analysis (PCA) to project the four-dimensional data into two principal components for visualization purposes only.</w:t>
+      </w:r>
+    </w:p>
+    <w:p>
+      <w:r>
+        <w:t xml:space="preserve">DBSCAN was applied to the standardized data using parameters ε = 0.6 and min_samples = 5. The algorithm identified several compact regions of high density corresponding to potential clusters while labeling certain ambiguous samples as noise. The resulting two-dimensional PCA projection revealed visually separable groups that broadly corresponded to the Iris species, although some overlap occurred between Iris versicolor and Iris virginica, which are known to have similar feature distributions. </w:t>
       </w:r>
     </w:p>
     <w:p>
@@ -11092,27 +10803,7 @@
           <w:sz w:val="22"/>
           <w:szCs w:val="22"/>
         </w:rPr>
-        <w:t xml:space="preserve">DBSCAN clustering of the Iris dataset visualized after PCA projection (ε = 0.6, </w:t>
-      </w:r>
-      <w:proofErr w:type="spellStart"/>
-      <w:r>
-        <w:rPr>
-          <w:i/>
-          <w:iCs/>
-          <w:sz w:val="22"/>
-          <w:szCs w:val="22"/>
-        </w:rPr>
-        <w:t>min_samples</w:t>
-      </w:r>
-      <w:proofErr w:type="spellEnd"/>
-      <w:r>
-        <w:rPr>
-          <w:i/>
-          <w:iCs/>
-          <w:sz w:val="22"/>
-          <w:szCs w:val="22"/>
-        </w:rPr>
-        <w:t xml:space="preserve"> = 5).</w:t>
+        <w:t>DBSCAN clustering of the Iris dataset visualized after PCA projection (ε = 0.6, min_samples = 5).</w:t>
       </w:r>
     </w:p>
     <w:p>
@@ -11127,39 +10818,7 @@
     </w:p>
     <w:p>
       <w:r>
-        <w:t xml:space="preserve">To examine DBSCAN’s </w:t>
-      </w:r>
-      <w:proofErr w:type="spellStart"/>
-      <w:r>
-        <w:t>behaviour</w:t>
-      </w:r>
-      <w:proofErr w:type="spellEnd"/>
-      <w:r>
-        <w:t xml:space="preserve"> when cluster densities differ, a synthetic dataset was generated using the </w:t>
-      </w:r>
-      <w:proofErr w:type="spellStart"/>
-      <w:r>
-        <w:t>make_</w:t>
-      </w:r>
-      <w:proofErr w:type="gramStart"/>
-      <w:r>
-        <w:t>blobs</w:t>
-      </w:r>
-      <w:proofErr w:type="spellEnd"/>
-      <w:r>
-        <w:t>(</w:t>
-      </w:r>
-      <w:proofErr w:type="gramEnd"/>
-      <w:r>
-        <w:t xml:space="preserve">) function with cluster standard deviations of [0.5, 1.5, 0.3], creating three groups of unequal density. The algorithm was executed with parameters ε = 0.8 and </w:t>
-      </w:r>
-      <w:proofErr w:type="spellStart"/>
-      <w:r>
-        <w:t>min_samples</w:t>
-      </w:r>
-      <w:proofErr w:type="spellEnd"/>
-      <w:r>
-        <w:t xml:space="preserve"> = 5.</w:t>
+        <w:t>To examine DBSCAN’s behaviour when cluster densities differ, a synthetic dataset was generated using the make_blobs() function with cluster standard deviations of [0.5, 1.5, 0.3], creating three groups of unequal density. The algorithm was executed with parameters ε = 0.8 and min_samples = 5.</w:t>
       </w:r>
     </w:p>
     <w:p>
@@ -11252,27 +10911,7 @@
           <w:sz w:val="22"/>
           <w:szCs w:val="22"/>
         </w:rPr>
-        <w:t xml:space="preserve">DBSCAN clustering of the Iris dataset visualized after PCA projection (ε = 0.6, </w:t>
-      </w:r>
-      <w:proofErr w:type="spellStart"/>
-      <w:r>
-        <w:rPr>
-          <w:i/>
-          <w:iCs/>
-          <w:sz w:val="22"/>
-          <w:szCs w:val="22"/>
-        </w:rPr>
-        <w:t>min_samples</w:t>
-      </w:r>
-      <w:proofErr w:type="spellEnd"/>
-      <w:r>
-        <w:rPr>
-          <w:i/>
-          <w:iCs/>
-          <w:sz w:val="22"/>
-          <w:szCs w:val="22"/>
-        </w:rPr>
-        <w:t xml:space="preserve"> = 5).</w:t>
+        <w:t>DBSCAN clustering of the Iris dataset visualized after PCA projection (ε = 0.6, min_samples = 5).</w:t>
       </w:r>
     </w:p>
     <w:p>
@@ -11473,47 +11112,27 @@
           <w:sz w:val="22"/>
           <w:szCs w:val="22"/>
         </w:rPr>
-        <w:t xml:space="preserve">Quantitative evaluation of DBSCAN performance on the two-moons dataset (ε = 0.2, </w:t>
-      </w:r>
-      <w:proofErr w:type="spellStart"/>
-      <w:r>
+        <w:t>Quantitative evaluation of DBSCAN performance on the two-moons dataset (ε = 0.2, min_samples = 5).</w:t>
+      </w:r>
+    </w:p>
+    <w:p>
+      <w:pPr>
         <w:rPr>
           <w:i/>
           <w:iCs/>
           <w:sz w:val="22"/>
           <w:szCs w:val="22"/>
         </w:rPr>
-        <w:t>min_samples</w:t>
-      </w:r>
-      <w:proofErr w:type="spellEnd"/>
-      <w:r>
+      </w:pPr>
+    </w:p>
+    <w:p>
+      <w:pPr>
         <w:rPr>
           <w:i/>
           <w:iCs/>
           <w:sz w:val="22"/>
           <w:szCs w:val="22"/>
         </w:rPr>
-        <w:t xml:space="preserve"> = 5).</w:t>
-      </w:r>
-    </w:p>
-    <w:p>
-      <w:pPr>
-        <w:rPr>
-          <w:i/>
-          <w:iCs/>
-          <w:sz w:val="22"/>
-          <w:szCs w:val="22"/>
-        </w:rPr>
-      </w:pPr>
-    </w:p>
-    <w:p>
-      <w:pPr>
-        <w:rPr>
-          <w:i/>
-          <w:iCs/>
-          <w:sz w:val="22"/>
-          <w:szCs w:val="22"/>
-        </w:rPr>
       </w:pPr>
     </w:p>
     <w:p>
@@ -11540,23 +11159,7 @@
         <w:jc w:val="left"/>
       </w:pPr>
       <w:r>
-        <w:t xml:space="preserve">With parameters </w:t>
-      </w:r>
-      <w:proofErr w:type="spellStart"/>
-      <w:r>
-        <w:t>min_cluster_size</w:t>
-      </w:r>
-      <w:proofErr w:type="spellEnd"/>
-      <w:r>
-        <w:t xml:space="preserve"> = 15 and </w:t>
-      </w:r>
-      <w:proofErr w:type="spellStart"/>
-      <w:r>
-        <w:t>min_samples</w:t>
-      </w:r>
-      <w:proofErr w:type="spellEnd"/>
-      <w:r>
-        <w:t xml:space="preserve"> = 5, HDBSCAN successfully detected three main clusters and a small number of noise points. Compared to DBSCAN, which struggled to separate the sparser middle group, HDBSCAN adaptively adjusted to local density variations, resulting in more accurate cluster boundaries and reduced misclassification of low-density points as noise.</w:t>
+        <w:t>With parameters min_cluster_size = 15 and min_samples = 5, HDBSCAN successfully detected three main clusters and a small number of noise points. Compared to DBSCAN, which struggled to separate the sparser middle group, HDBSCAN adaptively adjusted to local density variations, resulting in more accurate cluster boundaries and reduced misclassification of low-density points as noise.</w:t>
       </w:r>
     </w:p>
     <w:p>
@@ -11650,47 +11253,7 @@
           <w:sz w:val="22"/>
           <w:szCs w:val="22"/>
         </w:rPr>
-        <w:t>HDBSCAN clustering on data with varying density (</w:t>
-      </w:r>
-      <w:proofErr w:type="spellStart"/>
-      <w:r>
-        <w:rPr>
-          <w:i/>
-          <w:iCs/>
-          <w:sz w:val="22"/>
-          <w:szCs w:val="22"/>
-        </w:rPr>
-        <w:t>min_cluster_size</w:t>
-      </w:r>
-      <w:proofErr w:type="spellEnd"/>
-      <w:r>
-        <w:rPr>
-          <w:i/>
-          <w:iCs/>
-          <w:sz w:val="22"/>
-          <w:szCs w:val="22"/>
-        </w:rPr>
-        <w:t xml:space="preserve"> = 15, </w:t>
-      </w:r>
-      <w:proofErr w:type="spellStart"/>
-      <w:r>
-        <w:rPr>
-          <w:i/>
-          <w:iCs/>
-          <w:sz w:val="22"/>
-          <w:szCs w:val="22"/>
-        </w:rPr>
-        <w:t>min_samples</w:t>
-      </w:r>
-      <w:proofErr w:type="spellEnd"/>
-      <w:r>
-        <w:rPr>
-          <w:i/>
-          <w:iCs/>
-          <w:sz w:val="22"/>
-          <w:szCs w:val="22"/>
-        </w:rPr>
-        <w:t xml:space="preserve"> = 5).</w:t>
+        <w:t>HDBSCAN clustering on data with varying density (min_cluster_size = 15, min_samples = 5).</w:t>
       </w:r>
       <w:r>
         <w:rPr>
@@ -11789,23 +11352,7 @@
           <w:i/>
           <w:iCs/>
         </w:rPr>
-        <w:t xml:space="preserve">DBSCAN is sensitive to its parameters ε (epsilon) and </w:t>
-      </w:r>
-      <w:proofErr w:type="spellStart"/>
-      <w:r>
-        <w:rPr>
-          <w:i/>
-          <w:iCs/>
-        </w:rPr>
-        <w:t>min_samples</w:t>
-      </w:r>
-      <w:proofErr w:type="spellEnd"/>
-      <w:r>
-        <w:rPr>
-          <w:i/>
-          <w:iCs/>
-        </w:rPr>
-        <w:t>. Small changes in these values can significantly affect the resulting clusters. It also struggles with datasets containing clusters of varying density, since a single global ε cannot accommodate both dense and sparse regions simultaneously. In addition, DBSCAN’s performance can degrade on very large or high-dimensional datasets because distance measures become less meaningful in such spaces.</w:t>
+        <w:t>DBSCAN is sensitive to its parameters ε (epsilon) and min_samples. Small changes in these values can significantly affect the resulting clusters. It also struggles with datasets containing clusters of varying density, since a single global ε cannot accommodate both dense and sparse regions simultaneously. In addition, DBSCAN’s performance can degrade on very large or high-dimensional datasets because distance measures become less meaningful in such spaces.</w:t>
       </w:r>
     </w:p>
     <w:p>
@@ -11887,15 +11434,7 @@
     </w:p>
     <w:p>
       <w:r>
-        <w:t xml:space="preserve">However, DBSCAN’s performance was found to be highly dependent on the choice of its parameters, ε and </w:t>
-      </w:r>
-      <w:proofErr w:type="spellStart"/>
-      <w:r>
-        <w:t>min_samples</w:t>
-      </w:r>
-      <w:proofErr w:type="spellEnd"/>
-      <w:r>
-        <w:t>, and it struggled when clusters exhibited varying densities. In contrast, HDBSCAN addressed this limitation by adaptively determining density thresholds, yielding more stable results and better separation of clusters with differing densities.</w:t>
+        <w:t>However, DBSCAN’s performance was found to be highly dependent on the choice of its parameters, ε and min_samples, and it struggled when clusters exhibited varying densities. In contrast, HDBSCAN addressed this limitation by adaptively determining density thresholds, yielding more stable results and better separation of clusters with differing densities.</w:t>
       </w:r>
     </w:p>
     <w:p>
@@ -11916,18 +11455,11 @@
         <w:t>3</w:t>
       </w:r>
       <w:r>
-        <w:t xml:space="preserve"> </w:t>
-      </w:r>
-      <w:proofErr w:type="gramStart"/>
-      <w:r>
-        <w:t xml:space="preserve">-  </w:t>
-      </w:r>
-      <w:proofErr w:type="spellStart"/>
+        <w:t xml:space="preserve"> -  </w:t>
+      </w:r>
       <w:r>
         <w:t>Hierarchial</w:t>
       </w:r>
-      <w:proofErr w:type="spellEnd"/>
-      <w:proofErr w:type="gramEnd"/>
       <w:r>
         <w:t xml:space="preserve"> Clustering</w:t>
       </w:r>
@@ -12205,15 +11737,7 @@
         <w:t xml:space="preserve"> </w:t>
       </w:r>
       <w:r>
-        <w:t xml:space="preserve">Average linkage uses the mean distance between all pairs of points across the two clusters. This approach provides a balanced </w:t>
-      </w:r>
-      <w:proofErr w:type="spellStart"/>
-      <w:r>
-        <w:t>behaviour</w:t>
-      </w:r>
-      <w:proofErr w:type="spellEnd"/>
-      <w:r>
-        <w:t>, avoiding the chaining effect of single linkage and the strict compactness of complete linkage.</w:t>
+        <w:t>Average linkage uses the mean distance between all pairs of points across the two clusters. This approach provides a balanced behaviour, avoiding the chaining effect of single linkage and the strict compactness of complete linkage.</w:t>
       </w:r>
       <w:r>
         <w:t xml:space="preserve"> </w:t>
@@ -12286,7 +11810,6 @@
         <w:t xml:space="preserve"> </w:t>
       </w:r>
       <w:hyperlink r:id="rId29" w:history="1">
-        <w:proofErr w:type="spellStart"/>
         <w:r>
           <w:rPr>
             <w:rStyle w:val="Hyperlink"/>
@@ -12294,7 +11817,6 @@
           </w:rPr>
           <w:t>Hierarchial_Clustering_Code</w:t>
         </w:r>
-        <w:proofErr w:type="spellEnd"/>
       </w:hyperlink>
     </w:p>
     <w:p>
@@ -12312,15 +11834,7 @@
         <w:jc w:val="left"/>
       </w:pPr>
       <w:r>
-        <w:t xml:space="preserve">To begin the experiment, a simple two-dimensional dataset was generated using the </w:t>
-      </w:r>
-      <w:proofErr w:type="spellStart"/>
-      <w:r>
-        <w:t>make_blobs</w:t>
-      </w:r>
-      <w:proofErr w:type="spellEnd"/>
-      <w:r>
-        <w:t xml:space="preserve"> function. The dataset contains 200 samples grouped around three well-separated cluster centers, each with a moderate standard deviation. This setup provides a clear structure that allows hierarchical clustering to reveal how points gradually merge into larger groups.</w:t>
+        <w:t>To begin the experiment, a simple two-dimensional dataset was generated using the make_blobs function. The dataset contains 200 samples grouped around three well-separated cluster centers, each with a moderate standard deviation. This setup provides a clear structure that allows hierarchical clustering to reveal how points gradually merge into larger groups.</w:t>
       </w:r>
     </w:p>
     <w:p>
@@ -12538,15 +12052,7 @@
         <w:jc w:val="left"/>
       </w:pPr>
       <w:r>
-        <w:t xml:space="preserve">Once the hierarchical structure is built, the next step is to extract a specific number of clusters from the dendrogram. In this experiment, the agglomerative algorithm uses Ward linkage and forms three clusters, which matches the natural grouping in the synthetic dataset. By specifying </w:t>
-      </w:r>
-      <w:proofErr w:type="spellStart"/>
-      <w:r>
-        <w:t>n_clusters</w:t>
-      </w:r>
-      <w:proofErr w:type="spellEnd"/>
-      <w:r>
-        <w:t xml:space="preserve"> = 3, the algorithm stops the merging process at the appropriate level and assigns each data point to one of the resulting clusters.</w:t>
+        <w:t>Once the hierarchical structure is built, the next step is to extract a specific number of clusters from the dendrogram. In this experiment, the agglomerative algorithm uses Ward linkage and forms three clusters, which matches the natural grouping in the synthetic dataset. By specifying n_clusters = 3, the algorithm stops the merging process at the appropriate level and assigns each data point to one of the resulting clusters.</w:t>
       </w:r>
     </w:p>
     <w:p>
@@ -12837,15 +12343,7 @@
         <w:t>The figure below</w:t>
       </w:r>
       <w:r>
-        <w:t xml:space="preserve"> shows the clustering result projected onto the first two principal components. The three clusters appear as distinct groups in the PCA space, and their structure broadly matches the expected species separation. One cluster aligns clearly with Iris </w:t>
-      </w:r>
-      <w:proofErr w:type="spellStart"/>
-      <w:r>
-        <w:t>setosa</w:t>
-      </w:r>
-      <w:proofErr w:type="spellEnd"/>
-      <w:r>
-        <w:t xml:space="preserve">, while the other two clusters overlap more, reflecting the known similarity between Iris versicolor and Iris virginica. This </w:t>
+        <w:t xml:space="preserve"> shows the clustering result projected onto the first two principal components. The three clusters appear as distinct groups in the PCA space, and their structure broadly matches the expected species separation. One cluster aligns clearly with Iris setosa, while the other two clusters overlap more, reflecting the known similarity between Iris versicolor and Iris virginica. This </w:t>
       </w:r>
       <w:r>
         <w:t>behavior</w:t>
@@ -13045,15 +12543,7 @@
         <w:jc w:val="left"/>
       </w:pPr>
       <w:r>
-        <w:t xml:space="preserve">To explore the hierarchical structure in more detail, the experiment used the </w:t>
-      </w:r>
-      <w:proofErr w:type="spellStart"/>
-      <w:r>
-        <w:t>fcluster</w:t>
-      </w:r>
-      <w:proofErr w:type="spellEnd"/>
-      <w:r>
-        <w:t xml:space="preserve"> function to extract clusters by cutting the dendrogram at specific distances. This approach makes it possible to control the level of granularity in the clustering result. A smaller cut height produces more clusters by stopping the merging process early, while a larger cut height merges points into broader groups. The figure below shows the clusters obtained when the dendrogram was cut at a distance of 10. The algorithm returned three clusters, which aligns with the natural structure of the synthetic dataset.</w:t>
+        <w:t>To explore the hierarchical structure in more detail, the experiment used the fcluster function to extract clusters by cutting the dendrogram at specific distances. This approach makes it possible to control the level of granularity in the clustering result. A smaller cut height produces more clusters by stopping the merging process early, while a larger cut height merges points into broader groups. The figure below shows the clusters obtained when the dendrogram was cut at a distance of 10. The algorithm returned three clusters, which aligns with the natural structure of the synthetic dataset.</w:t>
       </w:r>
     </w:p>
     <w:p>
@@ -14428,7 +13918,6 @@
         <w:t xml:space="preserve"> </w:t>
       </w:r>
       <w:hyperlink r:id="rId39" w:history="1">
-        <w:proofErr w:type="spellStart"/>
         <w:r>
           <w:rPr>
             <w:rStyle w:val="Hyperlink"/>
@@ -14436,7 +13925,6 @@
           </w:rPr>
           <w:t>Regression_Code</w:t>
         </w:r>
-        <w:proofErr w:type="spellEnd"/>
       </w:hyperlink>
       <w:r>
         <w:t xml:space="preserve"> </w:t>
@@ -14492,36 +13980,7 @@
         <w:t>Salary_Data.csv</w:t>
       </w:r>
       <w:r>
-        <w:t xml:space="preserve"> dataset is loaded using </w:t>
-      </w:r>
-      <w:proofErr w:type="spellStart"/>
-      <w:proofErr w:type="gramStart"/>
-      <w:r>
-        <w:t>pandas.read</w:t>
-      </w:r>
-      <w:proofErr w:type="gramEnd"/>
-      <w:r>
-        <w:t>_</w:t>
-      </w:r>
-      <w:proofErr w:type="gramStart"/>
-      <w:r>
-        <w:t>csv</w:t>
-      </w:r>
-      <w:proofErr w:type="spellEnd"/>
-      <w:r>
-        <w:t>(</w:t>
-      </w:r>
-      <w:proofErr w:type="gramEnd"/>
-      <w:r>
-        <w:t xml:space="preserve">). It contains 30 observations and two variables, making it well suited for demonstrating simple linear regression in a controlled and interpretable setting. The dataset consists of one explanatory variable, </w:t>
-      </w:r>
-      <w:proofErr w:type="spellStart"/>
-      <w:r>
-        <w:t>YearsExperience</w:t>
-      </w:r>
-      <w:proofErr w:type="spellEnd"/>
-      <w:r>
-        <w:t>, and one target variable, Salary.</w:t>
+        <w:t xml:space="preserve"> dataset is loaded using pandas.read_csv(). It contains 30 observations and two variables, making it well suited for demonstrating simple linear regression in a controlled and interpretable setting. The dataset consists of one explanatory variable, YearsExperience, and one target variable, Salary.</w:t>
       </w:r>
     </w:p>
     <w:p>
@@ -14545,17 +14004,7 @@
         <w:jc w:val="left"/>
       </w:pPr>
       <w:r>
-        <w:t xml:space="preserve">Descriptive statistics computed using </w:t>
-      </w:r>
-      <w:proofErr w:type="spellStart"/>
-      <w:proofErr w:type="gramStart"/>
-      <w:r>
-        <w:t>df.describe</w:t>
-      </w:r>
-      <w:proofErr w:type="spellEnd"/>
-      <w:proofErr w:type="gramEnd"/>
-      <w:r>
-        <w:t>() summarize the central tendency and dispersion of both variables. Years of experience span from 1.1 to 10.5 years, while salaries range from €37,731 to €122,391, indicating sufficient variability to meaningfully evaluate a predictive relationship.</w:t>
+        <w:t>Descriptive statistics computed using df.describe() summarize the central tendency and dispersion of both variables. Years of experience span from 1.1 to 10.5 years, while salaries range from €37,731 to €122,391, indicating sufficient variability to meaningfully evaluate a predictive relationship.</w:t>
       </w:r>
     </w:p>
     <w:p>
@@ -14802,15 +14251,7 @@
         <w:jc w:val="left"/>
       </w:pPr>
       <w:r>
-        <w:t xml:space="preserve">A simple linear regression model is constructed by assigning </w:t>
-      </w:r>
-      <w:proofErr w:type="spellStart"/>
-      <w:r>
-        <w:t>YearsExperience</w:t>
-      </w:r>
-      <w:proofErr w:type="spellEnd"/>
-      <w:r>
-        <w:t xml:space="preserve"> to </w:t>
+        <w:t xml:space="preserve">A simple linear regression model is constructed by assigning YearsExperience to </w:t>
       </w:r>
       <m:oMath>
         <m:r>
@@ -15303,50 +14744,34 @@
           <w:b/>
           <w:bCs/>
         </w:rPr>
-        <w:t xml:space="preserve">. Residual Distribution (Test </w:t>
-      </w:r>
-      <w:proofErr w:type="gramStart"/>
+        <w:t>. Residual Distribution (Test Set)</w:t>
+      </w:r>
       <w:r>
         <w:rPr>
           <w:b/>
           <w:bCs/>
         </w:rPr>
-        <w:t>Set)</w:t>
+        <w:t xml:space="preserve">         </w:t>
       </w:r>
       <w:r>
         <w:rPr>
           <w:b/>
           <w:bCs/>
         </w:rPr>
-        <w:t xml:space="preserve">   </w:t>
-      </w:r>
-      <w:proofErr w:type="gramEnd"/>
+        <w:t xml:space="preserve">Figure </w:t>
+      </w:r>
       <w:r>
         <w:rPr>
           <w:b/>
           <w:bCs/>
         </w:rPr>
-        <w:t xml:space="preserve">      </w:t>
+        <w:t>32</w:t>
       </w:r>
       <w:r>
         <w:rPr>
           <w:b/>
           <w:bCs/>
         </w:rPr>
-        <w:t xml:space="preserve">Figure </w:t>
-      </w:r>
-      <w:r>
-        <w:rPr>
-          <w:b/>
-          <w:bCs/>
-        </w:rPr>
-        <w:t>32</w:t>
-      </w:r>
-      <w:r>
-        <w:rPr>
-          <w:b/>
-          <w:bCs/>
-        </w:rPr>
         <w:t>. Q–Q Plot (Test Set Residuals)</w:t>
       </w:r>
     </w:p>
@@ -15388,28 +14813,7 @@
         <w:jc w:val="left"/>
       </w:pPr>
       <w:r>
-        <w:t xml:space="preserve">The dataset is loaded using </w:t>
-      </w:r>
-      <w:proofErr w:type="spellStart"/>
-      <w:proofErr w:type="gramStart"/>
-      <w:r>
-        <w:t>pandas.read</w:t>
-      </w:r>
-      <w:proofErr w:type="gramEnd"/>
-      <w:r>
-        <w:t>_</w:t>
-      </w:r>
-      <w:proofErr w:type="gramStart"/>
-      <w:r>
-        <w:t>csv</w:t>
-      </w:r>
-      <w:proofErr w:type="spellEnd"/>
-      <w:r>
-        <w:t>(</w:t>
-      </w:r>
-      <w:proofErr w:type="gramEnd"/>
-      <w:r>
-        <w:t>) and contains 50 observations and five variables. The target variable is Profit, while the explanatory variables consist of three numerical predictors (R&amp;D Spend, Administration, Marketing Spend) and one categorical predictor (State).</w:t>
+        <w:t>The dataset is loaded using pandas.read_csv() and contains 50 observations and five variables. The target variable is Profit, while the explanatory variables consist of three numerical predictors (R&amp;D Spend, Administration, Marketing Spend) and one categorical predictor (State).</w:t>
       </w:r>
     </w:p>
     <w:p>
@@ -15834,23 +15238,7 @@
         <w:jc w:val="left"/>
       </w:pPr>
       <w:r>
-        <w:t xml:space="preserve">Multiple linear regression requires numerical input features. Since State is a categorical variable, it cannot be directly used in the regression model. To address this, one-hot encoding is applied using a </w:t>
-      </w:r>
-      <w:proofErr w:type="spellStart"/>
-      <w:r>
-        <w:t>ColumnTransformer</w:t>
-      </w:r>
-      <w:proofErr w:type="spellEnd"/>
-      <w:r>
-        <w:t xml:space="preserve"> combined with </w:t>
-      </w:r>
-      <w:proofErr w:type="spellStart"/>
-      <w:r>
-        <w:t>OneHotEncoder</w:t>
-      </w:r>
-      <w:proofErr w:type="spellEnd"/>
-      <w:r>
-        <w:t>.</w:t>
+        <w:t>Multiple linear regression requires numerical input features. Since State is a categorical variable, it cannot be directly used in the regression model. To address this, one-hot encoding is applied using a ColumnTransformer combined with OneHotEncoder.</w:t>
       </w:r>
     </w:p>
     <w:p>
@@ -16121,30 +15509,14 @@
           <w:i/>
           <w:iCs/>
         </w:rPr>
-        <w:t xml:space="preserve"> Residual Distribution (Test </w:t>
-      </w:r>
-      <w:proofErr w:type="gramStart"/>
+        <w:t xml:space="preserve"> Residual Distribution (Test Set)</w:t>
+      </w:r>
       <w:r>
         <w:rPr>
           <w:i/>
           <w:iCs/>
         </w:rPr>
-        <w:t>Set)</w:t>
-      </w:r>
-      <w:r>
-        <w:rPr>
-          <w:i/>
-          <w:iCs/>
-        </w:rPr>
-        <w:t xml:space="preserve">   </w:t>
-      </w:r>
-      <w:proofErr w:type="gramEnd"/>
-      <w:r>
-        <w:rPr>
-          <w:i/>
-          <w:iCs/>
-        </w:rPr>
-        <w:t xml:space="preserve">        </w:t>
+        <w:t xml:space="preserve">           </w:t>
       </w:r>
       <w:r>
         <w:rPr>
@@ -17164,15 +16536,7 @@
         <w:t xml:space="preserve"> </w:t>
       </w:r>
       <w:r>
-        <w:t xml:space="preserve">and demonstrated how multiple variables jointly contribute to prediction. The strong test performance confirmed that the model generalized well, while the drop in Adjusted R² highlighted an important methodological point: adding predictors increases complexity, and not all variables necessarily provide meaningful additional explanatory power. Residual analysis further supported the suitability of the linear model for the </w:t>
-      </w:r>
-      <w:proofErr w:type="gramStart"/>
-      <w:r>
-        <w:t>startups</w:t>
-      </w:r>
-      <w:proofErr w:type="gramEnd"/>
-      <w:r>
-        <w:t xml:space="preserve"> dataset.</w:t>
+        <w:t>and demonstrated how multiple variables jointly contribute to prediction. The strong test performance confirmed that the model generalized well, while the drop in Adjusted R² highlighted an important methodological point: adding predictors increases complexity, and not all variables necessarily provide meaningful additional explanatory power. Residual analysis further supported the suitability of the linear model for the startups dataset.</w:t>
       </w:r>
     </w:p>
     <w:p>
@@ -17790,6 +17154,9 @@
             <m:t>P(y=1∣X)=σ(z)</m:t>
           </m:r>
           <m:r>
+            <m:rPr>
+              <m:sty m:val="p"/>
+            </m:rPr>
             <w:br/>
           </m:r>
         </m:oMath>
@@ -18099,7 +17466,6 @@
         <w:t xml:space="preserve"> </w:t>
       </w:r>
       <w:hyperlink r:id="rId59" w:history="1">
-        <w:proofErr w:type="spellStart"/>
         <w:r>
           <w:rPr>
             <w:rStyle w:val="Hyperlink"/>
@@ -18107,7 +17473,6 @@
           </w:rPr>
           <w:t>Logistic_Regression_Code</w:t>
         </w:r>
-        <w:proofErr w:type="spellEnd"/>
       </w:hyperlink>
     </w:p>
     <w:p>
@@ -18212,23 +17577,7 @@
     </w:p>
     <w:p>
       <w:r>
-        <w:t xml:space="preserve">Before training, both predictors are standardized using </w:t>
-      </w:r>
-      <w:proofErr w:type="spellStart"/>
-      <w:r>
-        <w:t>StandardScaler</w:t>
-      </w:r>
-      <w:proofErr w:type="spellEnd"/>
-      <w:r>
-        <w:t xml:space="preserve">. This step is essential because </w:t>
-      </w:r>
-      <w:proofErr w:type="spellStart"/>
-      <w:r>
-        <w:t>EstimatedSalary</w:t>
-      </w:r>
-      <w:proofErr w:type="spellEnd"/>
-      <w:r>
-        <w:t xml:space="preserve"> has a much larger numeric scale than Age. Without scaling, the optimization procedure would be dominated by the salary feature’s magnitude, slowing </w:t>
+        <w:t xml:space="preserve">Before training, both predictors are standardized using StandardScaler. This step is essential because EstimatedSalary has a much larger numeric scale than Age. Without scaling, the optimization procedure would be dominated by the salary feature’s magnitude, slowing </w:t>
       </w:r>
       <w:r>
         <w:lastRenderedPageBreak/>
@@ -18546,15 +17895,7 @@
         <w:t>Purchased</w:t>
       </w:r>
       <w:r>
-        <w:t xml:space="preserve">. Observations close to the boundary represent cases where small changes in age or salary </w:t>
-      </w:r>
-      <w:proofErr w:type="gramStart"/>
-      <w:r>
-        <w:t>lead</w:t>
-      </w:r>
-      <w:proofErr w:type="gramEnd"/>
-      <w:r>
-        <w:t xml:space="preserve"> to different predicted outcomes. The presence of both classes in this narrow transition zone reflects genuine overlap in user behavior</w:t>
+        <w:t>. Observations close to the boundary represent cases where small changes in age or salary lead to different predicted outcomes. The presence of both classes in this narrow transition zone reflects genuine overlap in user behavior</w:t>
       </w:r>
       <w:r>
         <w:t xml:space="preserve">. </w:t>
@@ -18700,30 +18041,14 @@
           <w:i/>
           <w:iCs/>
         </w:rPr>
-        <w:t xml:space="preserve">Decision Boundary (Training </w:t>
-      </w:r>
-      <w:proofErr w:type="gramStart"/>
-      <w:r>
-        <w:rPr>
-          <w:i/>
-          <w:iCs/>
-        </w:rPr>
-        <w:t>Set)</w:t>
+        <w:t>Decision Boundary (Training Set)</w:t>
       </w:r>
       <w:r>
         <w:rPr>
           <w:b/>
           <w:bCs/>
         </w:rPr>
-        <w:t xml:space="preserve">   </w:t>
-      </w:r>
-      <w:proofErr w:type="gramEnd"/>
-      <w:r>
-        <w:rPr>
-          <w:b/>
-          <w:bCs/>
-        </w:rPr>
-        <w:t xml:space="preserve">         </w:t>
+        <w:t xml:space="preserve">            </w:t>
       </w:r>
       <w:r>
         <w:rPr>
@@ -19177,7 +18502,6 @@
         <w:t xml:space="preserve"> </w:t>
       </w:r>
       <w:hyperlink r:id="rId66" w:history="1">
-        <w:proofErr w:type="spellStart"/>
         <w:r>
           <w:rPr>
             <w:rStyle w:val="Hyperlink"/>
@@ -19185,7 +18509,6 @@
           </w:rPr>
           <w:t>KNN_Code</w:t>
         </w:r>
-        <w:proofErr w:type="spellEnd"/>
       </w:hyperlink>
     </w:p>
     <w:p>
@@ -19200,23 +18523,7 @@
     </w:p>
     <w:p>
       <w:r>
-        <w:t xml:space="preserve">A synthetic two-dimensional dataset was generated using the </w:t>
-      </w:r>
-      <w:proofErr w:type="spellStart"/>
-      <w:r>
-        <w:t>make_</w:t>
-      </w:r>
-      <w:proofErr w:type="gramStart"/>
-      <w:r>
-        <w:t>classification</w:t>
-      </w:r>
-      <w:proofErr w:type="spellEnd"/>
-      <w:r>
-        <w:t>(</w:t>
-      </w:r>
-      <w:proofErr w:type="gramEnd"/>
-      <w:r>
-        <w:t>) function from the scikit-learn library. The dataset consisted of 300 samples with two informative features and three distinct class labels.</w:t>
+        <w:t>A synthetic two-dimensional dataset was generated using the make_classification() function from the scikit-learn library. The dataset consisted of 300 samples with two informative features and three distinct class labels.</w:t>
       </w:r>
     </w:p>
     <w:p>
@@ -19317,15 +18624,7 @@
     </w:p>
     <w:p>
       <w:r>
-        <w:t xml:space="preserve">The dataset was then split into training (80%) and test (20%) sets. Feature standardization was applied using </w:t>
-      </w:r>
-      <w:proofErr w:type="spellStart"/>
-      <w:r>
-        <w:t>StandardScaler</w:t>
-      </w:r>
-      <w:proofErr w:type="spellEnd"/>
-      <w:r>
-        <w:t xml:space="preserve"> to ensure that both features contributed equally to distance calculations.</w:t>
+        <w:t>The dataset was then split into training (80%) and test (20%) sets. Feature standardization was applied using StandardScaler to ensure that both features contributed equally to distance calculations.</w:t>
       </w:r>
     </w:p>
     <w:p>
@@ -19679,6 +18978,7 @@
     <w:p>
       <w:pPr>
         <w:pStyle w:val="Heading1"/>
+        <w:jc w:val="left"/>
       </w:pPr>
       <w:bookmarkStart w:id="75" w:name="_Toc217906519"/>
       <w:r>
@@ -19701,7 +19001,19 @@
         <w:t>Tree</w:t>
       </w:r>
       <w:r>
-        <w:t>-Based Clustering (Silhouette-Based Splitting)</w:t>
+        <w:t>-Based</w:t>
+      </w:r>
+      <w:r>
+        <w:t xml:space="preserve"> </w:t>
+      </w:r>
+      <w:r>
+        <w:t>Clustering</w:t>
+      </w:r>
+      <w:r>
+        <w:t xml:space="preserve"> </w:t>
+      </w:r>
+      <w:r>
+        <w:t>(Silhouette Splitting)</w:t>
       </w:r>
       <w:bookmarkEnd w:id="75"/>
     </w:p>
@@ -19725,6 +19037,58 @@
       <w:r>
         <w:t>…</w:t>
       </w:r>
+    </w:p>
+    <w:p/>
+    <w:p>
+      <w:pPr>
+        <w:pStyle w:val="Heading2"/>
+      </w:pPr>
+      <w:r>
+        <w:t>Objective</w:t>
+      </w:r>
+    </w:p>
+    <w:p>
+      <w:r>
+        <w:t>T</w:t>
+      </w:r>
+      <w:r>
+        <w:t>his experiment aims to …</w:t>
+      </w:r>
+    </w:p>
+    <w:p/>
+    <w:p>
+      <w:pPr>
+        <w:pStyle w:val="Heading2"/>
+      </w:pPr>
+      <w:r>
+        <w:t>Code</w:t>
+      </w:r>
+    </w:p>
+    <w:p>
+      <w:r>
+        <w:t xml:space="preserve">The </w:t>
+      </w:r>
+      <w:r>
+        <w:t>tree Based Clustering</w:t>
+      </w:r>
+      <w:r>
+        <w:t xml:space="preserve"> </w:t>
+      </w:r>
+      <w:r>
+        <w:t>Code used in this experiment is available at the following GitHub repository:</w:t>
+      </w:r>
+      <w:r>
+        <w:t xml:space="preserve"> </w:t>
+      </w:r>
+      <w:hyperlink r:id="rId71" w:history="1">
+        <w:r>
+          <w:rPr>
+            <w:rStyle w:val="Hyperlink"/>
+            <w:color w:val="EE0000"/>
+          </w:rPr>
+          <w:t>Regression_Code</w:t>
+        </w:r>
+      </w:hyperlink>
     </w:p>
     <w:sectPr>
       <w:pgSz w:w="12240" w:h="15840"/>
@@ -28029,7 +27393,7 @@
   <w:style w:type="paragraph" w:default="1" w:styleId="Normal">
     <w:name w:val="Normal"/>
     <w:qFormat/>
-    <w:rsid w:val="00B61564"/>
+    <w:rsid w:val="00194A3C"/>
     <w:pPr>
       <w:jc w:val="both"/>
     </w:pPr>

</xml_diff>